<commit_message>
Updated project report files'
</commit_message>
<xml_diff>
--- a/SC-project-2026.docx
+++ b/SC-project-2026.docx
@@ -349,23 +349,13 @@
           <w:sz w:val="28"/>
         </w:rPr>
       </w:pPr>
-      <w:proofErr w:type="spellStart"/>
       <w:r>
         <w:rPr>
           <w:b/>
           <w:spacing w:val="-2"/>
           <w:sz w:val="28"/>
         </w:rPr>
-        <w:t>Thandalam</w:t>
-      </w:r>
-      <w:proofErr w:type="spellEnd"/>
-      <w:r>
-        <w:rPr>
-          <w:b/>
-          <w:spacing w:val="-2"/>
-          <w:sz w:val="28"/>
-        </w:rPr>
-        <w:t>, Chennai-602015</w:t>
+        <w:t>Thandalam, Chennai-602015</w:t>
       </w:r>
     </w:p>
     <w:p>
@@ -695,21 +685,12 @@
                 <w:sz w:val="24"/>
               </w:rPr>
             </w:pPr>
-            <w:proofErr w:type="spellStart"/>
             <w:r>
               <w:rPr>
                 <w:spacing w:val="-4"/>
                 <w:sz w:val="24"/>
               </w:rPr>
-              <w:t>S.No</w:t>
-            </w:r>
-            <w:proofErr w:type="spellEnd"/>
-            <w:r>
-              <w:rPr>
-                <w:spacing w:val="-4"/>
-                <w:sz w:val="24"/>
-              </w:rPr>
-              <w:t>.</w:t>
+              <w:t>S.No.</w:t>
             </w:r>
           </w:p>
         </w:tc>
@@ -2704,13 +2685,8 @@
         </w:rPr>
         <w:t xml:space="preserve"> </w:t>
       </w:r>
-      <w:proofErr w:type="spellStart"/>
-      <w:r>
-        <w:t>Devops</w:t>
-      </w:r>
-      <w:proofErr w:type="spellEnd"/>
-      <w:r>
-        <w:t xml:space="preserve"> environment by</w:t>
+      <w:r>
+        <w:t>Devops environment by</w:t>
       </w:r>
       <w:r>
         <w:rPr>
@@ -3200,11 +3176,9 @@
         </w:rPr>
         <w:t xml:space="preserve"> </w:t>
       </w:r>
-      <w:proofErr w:type="spellStart"/>
       <w:r>
         <w:t>Devops</w:t>
       </w:r>
-      <w:proofErr w:type="spellEnd"/>
       <w:r>
         <w:rPr>
           <w:spacing w:val="47"/>
@@ -3750,19 +3724,11 @@
         <w:rPr>
           <w:rFonts w:ascii="Arial MT"/>
         </w:rPr>
-        <w:t xml:space="preserve">DevOps dashboard </w:t>
-      </w:r>
-      <w:proofErr w:type="gramStart"/>
-      <w:r>
-        <w:rPr>
-          <w:rFonts w:ascii="Arial MT"/>
-        </w:rPr>
-        <w:t>successfully.</w:t>
+        <w:t>DevOps dashboard successfully.</w:t>
       </w:r>
       <w:r>
         <w:t>.</w:t>
       </w:r>
-      <w:proofErr w:type="gramEnd"/>
     </w:p>
     <w:p>
       <w:pPr>
@@ -7392,7 +7358,6 @@
         </w:rPr>
         <w:t xml:space="preserve">created </w:t>
       </w:r>
-      <w:proofErr w:type="spellStart"/>
       <w:r>
         <w:rPr>
           <w:spacing w:val="-2"/>
@@ -7400,7 +7365,6 @@
         </w:rPr>
         <w:t>succesS</w:t>
       </w:r>
-      <w:proofErr w:type="spellEnd"/>
     </w:p>
     <w:p>
       <w:pPr>
@@ -7938,16 +7902,7 @@
         <w:t xml:space="preserve"> </w:t>
       </w:r>
       <w:r>
-        <w:t>Product</w:t>
-      </w:r>
-      <w:r>
-        <w:rPr>
-          <w:spacing w:val="-1"/>
-        </w:rPr>
-        <w:t xml:space="preserve"> </w:t>
-      </w:r>
-      <w:r>
-        <w:t>Category</w:t>
+        <w:t>Hospital Appointment</w:t>
       </w:r>
       <w:r>
         <w:rPr>
@@ -8709,7 +8664,16 @@
         <w:t xml:space="preserve"> </w:t>
       </w:r>
       <w:r>
-        <w:t>Product</w:t>
+        <w:t>Hospital Appointment</w:t>
+      </w:r>
+      <w:r>
+        <w:rPr>
+          <w:spacing w:val="-9"/>
+        </w:rPr>
+        <w:t xml:space="preserve"> </w:t>
+      </w:r>
+      <w:r>
+        <w:t>Management</w:t>
       </w:r>
       <w:r>
         <w:rPr>
@@ -8718,22 +8682,10 @@
         <w:t xml:space="preserve"> </w:t>
       </w:r>
       <w:r>
-        <w:t>Category</w:t>
-      </w:r>
-      <w:r>
-        <w:rPr>
-          <w:spacing w:val="-10"/>
-        </w:rPr>
-        <w:t xml:space="preserve"> </w:t>
-      </w:r>
-      <w:r>
-        <w:t xml:space="preserve">Management </w:t>
-      </w:r>
-      <w:r>
         <w:rPr>
           <w:spacing w:val="-2"/>
         </w:rPr>
-        <w:t>System.</w:t>
+        <w:t>System</w:t>
       </w:r>
     </w:p>
     <w:p>
@@ -9237,26 +9189,14 @@
         <w:t>–</w:t>
       </w:r>
       <w:r>
-        <w:rPr>
-          <w:spacing w:val="-8"/>
-        </w:rPr>
-        <w:t xml:space="preserve"> </w:t>
-      </w:r>
-      <w:r>
-        <w:t>Product</w:t>
-      </w:r>
-      <w:r>
-        <w:rPr>
-          <w:spacing w:val="-6"/>
-        </w:rPr>
-        <w:t xml:space="preserve"> </w:t>
-      </w:r>
-      <w:r>
-        <w:t>Category</w:t>
-      </w:r>
-      <w:r>
-        <w:rPr>
-          <w:spacing w:val="-11"/>
+        <w:t xml:space="preserve"> </w:t>
+      </w:r>
+      <w:r>
+        <w:t>Hospital Appointment</w:t>
+      </w:r>
+      <w:r>
+        <w:rPr>
+          <w:spacing w:val="-9"/>
         </w:rPr>
         <w:t xml:space="preserve"> </w:t>
       </w:r>
@@ -9265,7 +9205,7 @@
       </w:r>
       <w:r>
         <w:rPr>
-          <w:spacing w:val="-6"/>
+          <w:spacing w:val="-5"/>
         </w:rPr>
         <w:t xml:space="preserve"> </w:t>
       </w:r>
@@ -9273,7 +9213,13 @@
         <w:rPr>
           <w:spacing w:val="-2"/>
         </w:rPr>
-        <w:t>System.</w:t>
+        <w:t>System</w:t>
+      </w:r>
+      <w:r>
+        <w:rPr>
+          <w:spacing w:val="-2"/>
+        </w:rPr>
+        <w:t>.</w:t>
       </w:r>
     </w:p>
     <w:p>
@@ -11936,22 +11882,34 @@
         <w:t xml:space="preserve"> </w:t>
       </w:r>
       <w:r>
-        <w:t>Product Category</w:t>
-      </w:r>
-      <w:r>
-        <w:rPr>
-          <w:spacing w:val="-10"/>
-        </w:rPr>
-        <w:t xml:space="preserve"> </w:t>
-      </w:r>
-      <w:r>
-        <w:t xml:space="preserve">Management </w:t>
+        <w:t>Hospital Appointment</w:t>
+      </w:r>
+      <w:r>
+        <w:rPr>
+          <w:spacing w:val="-9"/>
+        </w:rPr>
+        <w:t xml:space="preserve"> </w:t>
+      </w:r>
+      <w:r>
+        <w:t>Management</w:t>
+      </w:r>
+      <w:r>
+        <w:rPr>
+          <w:spacing w:val="-5"/>
+        </w:rPr>
+        <w:t xml:space="preserve"> </w:t>
       </w:r>
       <w:r>
         <w:rPr>
           <w:spacing w:val="-2"/>
         </w:rPr>
-        <w:t>System.</w:t>
+        <w:t>System</w:t>
+      </w:r>
+      <w:r>
+        <w:rPr>
+          <w:spacing w:val="-2"/>
+        </w:rPr>
+        <w:t>.</w:t>
       </w:r>
     </w:p>
     <w:p>
@@ -12380,139 +12338,141 @@
         <w:pStyle w:val="BodyText"/>
         <w:spacing w:line="278" w:lineRule="auto"/>
         <w:ind w:left="360" w:right="800"/>
-      </w:pPr>
-      <w:proofErr w:type="spellStart"/>
-      <w:proofErr w:type="gramStart"/>
-      <w:r>
-        <w:rPr>
-          <w:b/>
-        </w:rPr>
-        <w:t>Result:</w:t>
-      </w:r>
-      <w:r>
-        <w:t>The</w:t>
-      </w:r>
-      <w:proofErr w:type="spellEnd"/>
-      <w:proofErr w:type="gramEnd"/>
-      <w:r>
-        <w:rPr>
-          <w:spacing w:val="-10"/>
-        </w:rPr>
-        <w:t xml:space="preserve"> </w:t>
-      </w:r>
-      <w:r>
-        <w:t>Class</w:t>
-      </w:r>
-      <w:r>
-        <w:rPr>
-          <w:spacing w:val="-3"/>
-        </w:rPr>
-        <w:t xml:space="preserve"> </w:t>
-      </w:r>
-      <w:r>
-        <w:t>Diagram</w:t>
-      </w:r>
-      <w:r>
-        <w:rPr>
-          <w:spacing w:val="-11"/>
-        </w:rPr>
-        <w:t xml:space="preserve"> </w:t>
-      </w:r>
-      <w:r>
-        <w:t>and</w:t>
-      </w:r>
-      <w:r>
-        <w:rPr>
-          <w:spacing w:val="-8"/>
-        </w:rPr>
-        <w:t xml:space="preserve"> </w:t>
-      </w:r>
-      <w:r>
-        <w:t>Sequence</w:t>
-      </w:r>
-      <w:r>
-        <w:rPr>
-          <w:spacing w:val="-9"/>
-        </w:rPr>
-        <w:t xml:space="preserve"> </w:t>
-      </w:r>
-      <w:r>
-        <w:t>Diagram</w:t>
-      </w:r>
-      <w:r>
-        <w:rPr>
-          <w:spacing w:val="-6"/>
-        </w:rPr>
-        <w:t xml:space="preserve"> </w:t>
-      </w:r>
-      <w:r>
-        <w:t>is</w:t>
-      </w:r>
-      <w:r>
-        <w:rPr>
-          <w:spacing w:val="-4"/>
-        </w:rPr>
-        <w:t xml:space="preserve"> </w:t>
-      </w:r>
-      <w:r>
-        <w:t>designed</w:t>
-      </w:r>
-      <w:r>
-        <w:rPr>
-          <w:spacing w:val="-8"/>
-        </w:rPr>
-        <w:t xml:space="preserve"> </w:t>
-      </w:r>
-      <w:r>
-        <w:t>Successfully</w:t>
-      </w:r>
-      <w:r>
-        <w:rPr>
-          <w:spacing w:val="-7"/>
-        </w:rPr>
-        <w:t xml:space="preserve"> </w:t>
-      </w:r>
-      <w:r>
-        <w:t>for</w:t>
-      </w:r>
-      <w:r>
-        <w:rPr>
-          <w:spacing w:val="-1"/>
-        </w:rPr>
-        <w:t xml:space="preserve"> </w:t>
-      </w:r>
-      <w:r>
-        <w:t>the</w:t>
-      </w:r>
-      <w:r>
-        <w:rPr>
-          <w:spacing w:val="-6"/>
-        </w:rPr>
-        <w:t xml:space="preserve"> </w:t>
-      </w:r>
-      <w:r>
-        <w:t>Product</w:t>
-      </w:r>
-      <w:r>
-        <w:rPr>
-          <w:spacing w:val="-3"/>
-        </w:rPr>
-        <w:t xml:space="preserve"> </w:t>
-      </w:r>
-      <w:r>
-        <w:t>Category Management System</w:t>
-      </w:r>
-    </w:p>
-    <w:p>
-      <w:pPr>
-        <w:pStyle w:val="BodyText"/>
-        <w:spacing w:line="278" w:lineRule="auto"/>
         <w:sectPr>
           <w:pgSz w:w="12240" w:h="15840"/>
           <w:pgMar w:top="1820" w:right="720" w:bottom="280" w:left="1080" w:header="720" w:footer="720" w:gutter="0"/>
           <w:cols w:space="720"/>
         </w:sectPr>
       </w:pPr>
+      <w:r>
+        <w:rPr>
+          <w:b/>
+        </w:rPr>
+        <w:t>Result:</w:t>
+      </w:r>
+      <w:r>
+        <w:t>The</w:t>
+      </w:r>
+      <w:r>
+        <w:rPr>
+          <w:spacing w:val="-10"/>
+        </w:rPr>
+        <w:t xml:space="preserve"> </w:t>
+      </w:r>
+      <w:r>
+        <w:t>Class</w:t>
+      </w:r>
+      <w:r>
+        <w:rPr>
+          <w:spacing w:val="-3"/>
+        </w:rPr>
+        <w:t xml:space="preserve"> </w:t>
+      </w:r>
+      <w:r>
+        <w:t>Diagram</w:t>
+      </w:r>
+      <w:r>
+        <w:rPr>
+          <w:spacing w:val="-11"/>
+        </w:rPr>
+        <w:t xml:space="preserve"> </w:t>
+      </w:r>
+      <w:r>
+        <w:t>and</w:t>
+      </w:r>
+      <w:r>
+        <w:rPr>
+          <w:spacing w:val="-8"/>
+        </w:rPr>
+        <w:t xml:space="preserve"> </w:t>
+      </w:r>
+      <w:r>
+        <w:t>Sequence</w:t>
+      </w:r>
+      <w:r>
+        <w:rPr>
+          <w:spacing w:val="-9"/>
+        </w:rPr>
+        <w:t xml:space="preserve"> </w:t>
+      </w:r>
+      <w:r>
+        <w:t>Diagram</w:t>
+      </w:r>
+      <w:r>
+        <w:rPr>
+          <w:spacing w:val="-6"/>
+        </w:rPr>
+        <w:t xml:space="preserve"> </w:t>
+      </w:r>
+      <w:r>
+        <w:t>is</w:t>
+      </w:r>
+      <w:r>
+        <w:rPr>
+          <w:spacing w:val="-4"/>
+        </w:rPr>
+        <w:t xml:space="preserve"> </w:t>
+      </w:r>
+      <w:r>
+        <w:t>designed</w:t>
+      </w:r>
+      <w:r>
+        <w:rPr>
+          <w:spacing w:val="-8"/>
+        </w:rPr>
+        <w:t xml:space="preserve"> </w:t>
+      </w:r>
+      <w:r>
+        <w:t>Successfully</w:t>
+      </w:r>
+      <w:r>
+        <w:rPr>
+          <w:spacing w:val="-7"/>
+        </w:rPr>
+        <w:t xml:space="preserve"> </w:t>
+      </w:r>
+      <w:r>
+        <w:t>for</w:t>
+      </w:r>
+      <w:r>
+        <w:rPr>
+          <w:spacing w:val="-1"/>
+        </w:rPr>
+        <w:t xml:space="preserve"> </w:t>
+      </w:r>
+      <w:r>
+        <w:t>the</w:t>
+      </w:r>
+      <w:r>
+        <w:rPr>
+          <w:spacing w:val="-6"/>
+        </w:rPr>
+        <w:t xml:space="preserve"> </w:t>
+      </w:r>
+      <w:r>
+        <w:t>Hospital Appointment</w:t>
+      </w:r>
+      <w:r>
+        <w:rPr>
+          <w:spacing w:val="-9"/>
+        </w:rPr>
+        <w:t xml:space="preserve"> </w:t>
+      </w:r>
+      <w:r>
+        <w:t>Management</w:t>
+      </w:r>
+      <w:r>
+        <w:rPr>
+          <w:spacing w:val="-5"/>
+        </w:rPr>
+        <w:t xml:space="preserve"> </w:t>
+      </w:r>
+      <w:r>
+        <w:rPr>
+          <w:spacing w:val="-2"/>
+        </w:rPr>
+        <w:t>System</w:t>
+      </w:r>
     </w:p>
     <w:p>
       <w:pPr>
@@ -13521,119 +13481,141 @@
         <w:pStyle w:val="BodyText"/>
         <w:spacing w:before="35"/>
         <w:ind w:left="360" w:right="800"/>
-      </w:pPr>
-      <w:r>
-        <w:t>The</w:t>
-      </w:r>
-      <w:r>
-        <w:rPr>
-          <w:spacing w:val="-7"/>
-        </w:rPr>
-        <w:t xml:space="preserve"> </w:t>
-      </w:r>
-      <w:r>
-        <w:t>Architecture</w:t>
-      </w:r>
-      <w:r>
-        <w:rPr>
-          <w:spacing w:val="-11"/>
-        </w:rPr>
-        <w:t xml:space="preserve"> </w:t>
-      </w:r>
-      <w:r>
-        <w:t>Diagram</w:t>
-      </w:r>
-      <w:r>
-        <w:rPr>
-          <w:spacing w:val="-13"/>
-        </w:rPr>
-        <w:t xml:space="preserve"> </w:t>
-      </w:r>
-      <w:r>
-        <w:t>and</w:t>
-      </w:r>
-      <w:r>
-        <w:rPr>
-          <w:spacing w:val="-10"/>
-        </w:rPr>
-        <w:t xml:space="preserve"> </w:t>
-      </w:r>
-      <w:r>
-        <w:t>ER</w:t>
-      </w:r>
-      <w:r>
-        <w:rPr>
-          <w:spacing w:val="-5"/>
-        </w:rPr>
-        <w:t xml:space="preserve"> </w:t>
-      </w:r>
-      <w:r>
-        <w:t>Diagram</w:t>
-      </w:r>
-      <w:r>
-        <w:rPr>
-          <w:spacing w:val="-13"/>
-        </w:rPr>
-        <w:t xml:space="preserve"> </w:t>
-      </w:r>
-      <w:r>
-        <w:t>is</w:t>
-      </w:r>
-      <w:r>
-        <w:rPr>
-          <w:spacing w:val="-6"/>
-        </w:rPr>
-        <w:t xml:space="preserve"> </w:t>
-      </w:r>
-      <w:r>
-        <w:t>designed</w:t>
-      </w:r>
-      <w:r>
-        <w:rPr>
-          <w:spacing w:val="-6"/>
-        </w:rPr>
-        <w:t xml:space="preserve"> </w:t>
-      </w:r>
-      <w:r>
-        <w:t>Successfully</w:t>
-      </w:r>
-      <w:r>
-        <w:rPr>
-          <w:spacing w:val="-6"/>
-        </w:rPr>
-        <w:t xml:space="preserve"> </w:t>
-      </w:r>
-      <w:r>
-        <w:t>for</w:t>
-      </w:r>
-      <w:r>
-        <w:rPr>
-          <w:spacing w:val="-3"/>
-        </w:rPr>
-        <w:t xml:space="preserve"> </w:t>
-      </w:r>
-      <w:r>
-        <w:t>the</w:t>
-      </w:r>
-      <w:r>
-        <w:rPr>
-          <w:spacing w:val="-8"/>
-        </w:rPr>
-        <w:t xml:space="preserve"> </w:t>
-      </w:r>
-      <w:r>
-        <w:t>Product Category Management System.</w:t>
-      </w:r>
-    </w:p>
-    <w:p>
-      <w:pPr>
-        <w:pStyle w:val="BodyText"/>
         <w:sectPr>
           <w:pgSz w:w="12240" w:h="15840"/>
           <w:pgMar w:top="1820" w:right="720" w:bottom="280" w:left="1080" w:header="720" w:footer="720" w:gutter="0"/>
           <w:cols w:space="720"/>
         </w:sectPr>
       </w:pPr>
+      <w:r>
+        <w:t>The</w:t>
+      </w:r>
+      <w:r>
+        <w:rPr>
+          <w:spacing w:val="-7"/>
+        </w:rPr>
+        <w:t xml:space="preserve"> </w:t>
+      </w:r>
+      <w:r>
+        <w:t>Architecture</w:t>
+      </w:r>
+      <w:r>
+        <w:rPr>
+          <w:spacing w:val="-11"/>
+        </w:rPr>
+        <w:t xml:space="preserve"> </w:t>
+      </w:r>
+      <w:r>
+        <w:t>Diagram</w:t>
+      </w:r>
+      <w:r>
+        <w:rPr>
+          <w:spacing w:val="-13"/>
+        </w:rPr>
+        <w:t xml:space="preserve"> </w:t>
+      </w:r>
+      <w:r>
+        <w:t>and</w:t>
+      </w:r>
+      <w:r>
+        <w:rPr>
+          <w:spacing w:val="-10"/>
+        </w:rPr>
+        <w:t xml:space="preserve"> </w:t>
+      </w:r>
+      <w:r>
+        <w:t>ER</w:t>
+      </w:r>
+      <w:r>
+        <w:rPr>
+          <w:spacing w:val="-5"/>
+        </w:rPr>
+        <w:t xml:space="preserve"> </w:t>
+      </w:r>
+      <w:r>
+        <w:t>Diagram</w:t>
+      </w:r>
+      <w:r>
+        <w:rPr>
+          <w:spacing w:val="-13"/>
+        </w:rPr>
+        <w:t xml:space="preserve"> </w:t>
+      </w:r>
+      <w:r>
+        <w:t>is</w:t>
+      </w:r>
+      <w:r>
+        <w:rPr>
+          <w:spacing w:val="-6"/>
+        </w:rPr>
+        <w:t xml:space="preserve"> </w:t>
+      </w:r>
+      <w:r>
+        <w:t>designed</w:t>
+      </w:r>
+      <w:r>
+        <w:rPr>
+          <w:spacing w:val="-6"/>
+        </w:rPr>
+        <w:t xml:space="preserve"> </w:t>
+      </w:r>
+      <w:r>
+        <w:t>Successfully</w:t>
+      </w:r>
+      <w:r>
+        <w:rPr>
+          <w:spacing w:val="-6"/>
+        </w:rPr>
+        <w:t xml:space="preserve"> </w:t>
+      </w:r>
+      <w:r>
+        <w:t>for</w:t>
+      </w:r>
+      <w:r>
+        <w:rPr>
+          <w:spacing w:val="-3"/>
+        </w:rPr>
+        <w:t xml:space="preserve"> </w:t>
+      </w:r>
+      <w:r>
+        <w:t>the</w:t>
+      </w:r>
+      <w:r>
+        <w:rPr>
+          <w:spacing w:val="-8"/>
+        </w:rPr>
+        <w:t xml:space="preserve"> </w:t>
+      </w:r>
+      <w:r>
+        <w:t>Hospital Appointment</w:t>
+      </w:r>
+      <w:r>
+        <w:rPr>
+          <w:spacing w:val="-9"/>
+        </w:rPr>
+        <w:t xml:space="preserve"> </w:t>
+      </w:r>
+      <w:r>
+        <w:t>Management</w:t>
+      </w:r>
+      <w:r>
+        <w:rPr>
+          <w:spacing w:val="-5"/>
+        </w:rPr>
+        <w:t xml:space="preserve"> </w:t>
+      </w:r>
+      <w:r>
+        <w:rPr>
+          <w:spacing w:val="-2"/>
+        </w:rPr>
+        <w:t>System</w:t>
+      </w:r>
+      <w:r>
+        <w:rPr>
+          <w:spacing w:val="-2"/>
+        </w:rPr>
+        <w:t>.</w:t>
+      </w:r>
     </w:p>
     <w:p>
       <w:pPr>
@@ -23843,16 +23825,8 @@
               <w:rPr>
                 <w:spacing w:val="-2"/>
               </w:rPr>
-              <w:t>/</w:t>
-            </w:r>
-            <w:proofErr w:type="gramStart"/>
-            <w:r>
-              <w:rPr>
-                <w:spacing w:val="-2"/>
-              </w:rPr>
-              <w:t>login</w:t>
-            </w:r>
-            <w:proofErr w:type="gramEnd"/>
+              <w:t>/login</w:t>
+            </w:r>
           </w:p>
         </w:tc>
       </w:tr>
@@ -25203,33 +25177,8 @@
           <w:b/>
           <w:spacing w:val="-2"/>
         </w:rPr>
-        <w:t>.</w:t>
-      </w:r>
-      <w:proofErr w:type="spellStart"/>
-      <w:r>
-        <w:rPr>
-          <w:b/>
-          <w:spacing w:val="-2"/>
-        </w:rPr>
-        <w:t>github</w:t>
-      </w:r>
-      <w:proofErr w:type="spellEnd"/>
-      <w:r>
-        <w:rPr>
-          <w:b/>
-          <w:spacing w:val="-2"/>
-        </w:rPr>
-        <w:t>/workflows/</w:t>
-      </w:r>
-      <w:proofErr w:type="spellStart"/>
-      <w:r>
-        <w:rPr>
-          <w:b/>
-          <w:spacing w:val="-2"/>
-        </w:rPr>
-        <w:t>nodejs.yml</w:t>
-      </w:r>
-      <w:proofErr w:type="spellEnd"/>
+        <w:t>.github/workflows/nodejs.yml</w:t>
+      </w:r>
     </w:p>
     <w:p>
       <w:pPr>
@@ -26510,21 +26459,7 @@
         <w:rPr>
           <w:b/>
         </w:rPr>
-        <w:t xml:space="preserve">Dependencies run: </w:t>
-      </w:r>
-      <w:proofErr w:type="spellStart"/>
-      <w:r>
-        <w:rPr>
-          <w:b/>
-        </w:rPr>
-        <w:t>npm</w:t>
-      </w:r>
-      <w:proofErr w:type="spellEnd"/>
-      <w:r>
-        <w:rPr>
-          <w:b/>
-        </w:rPr>
-        <w:t xml:space="preserve"> install</w:t>
+        <w:t>Dependencies run: npm install</w:t>
       </w:r>
     </w:p>
     <w:p>

</xml_diff>